<commit_message>
paper3: put the title on one line in the Word build
ScholarOne's pre-fill parser reads the two-line title block in the .docx as
two title candidates and concatenates them, so the submission form came up
with the title entered twice (22 words instead of 11). The Word build now
emits the title as a single line; the typeset PDF keeps the break, where it
reads better.

Co-Authored-By: Claude Opus 5 <noreply@anthropic.com>
Claude-Session: https://claude.ai/code/session_012NgwaUXsd86P5pxtpLwPwh
</commit_message>
<xml_diff>
--- a/docs/research/definitions_paper/submission_manuscript.docx
+++ b/docs/research/definitions_paper/submission_manuscript.docx
@@ -79,17 +79,7 @@
           <w:bCs/>
           <w:b/>
         </w:rPr>
-        <w:t xml:space="preserve">What Counts as an Establishment?</w:t>
-      </w:r>
-      <w:r>
-        <w:br/>
-      </w:r>
-      <w:r>
-        <w:rPr>
-          <w:bCs/>
-          <w:b/>
-        </w:rPr>
-        <w:t xml:space="preserve">Definitional Fragmentation Across Saudi Arabian Legislation</w:t>
+        <w:t xml:space="preserve">What Counts as an Establishment? Definitional Fragmentation Across Saudi Arabian Legislation</w:t>
       </w:r>
     </w:p>
     <w:bookmarkStart w:id="20" w:name="abstract"/>

</xml_diff>

<commit_message>
two footnotes pointed the reviewer at a statement the anonymised build deletes
The declarations block, data availability included, is gated on \ifanon --
correctly, because it carries the repository address that names the author.
But two footnotes said 'see the data availability statement below', and in
the anonymised manuscript there is nothing below. A referee would have
followed the pointer twice and found nothing, in a paper whose argument rests
on its data being inspectable.

Found by reading the proof the publisher built, not by any check here: no
guard compares a cross-reference against the build that resolves it. Both
footnotes are now gated too, and the anonymised text says where the statement
is and why it is not printed.
</commit_message>
<xml_diff>
--- a/docs/research/definitions_paper/submission_manuscript.docx
+++ b/docs/research/definitions_paper/submission_manuscript.docx
@@ -7999,7 +7999,19 @@
         <w:t xml:space="preserve"> </w:t>
       </w:r>
       <w:r>
-        <w:t xml:space="preserve">licensed; see the data availability statement below.</w:t>
+        <w:t xml:space="preserve">licensed; the repository is named in the data availability statement</w:t>
+      </w:r>
+      <w:r>
+        <w:t xml:space="preserve"> </w:t>
+      </w:r>
+      <w:r>
+        <w:t xml:space="preserve">supplied with this submission, which is withheld from the anonymised text</w:t>
+      </w:r>
+      <w:r>
+        <w:t xml:space="preserve"> </w:t>
+      </w:r>
+      <w:r>
+        <w:t xml:space="preserve">because its address identifies the author.</w:t>
       </w:r>
     </w:p>
   </w:footnote>
@@ -8470,7 +8482,7 @@
         <w:t xml:space="preserve"> </w:t>
       </w:r>
       <w:r>
-        <w:t xml:space="preserve">data availability statement.</w:t>
+        <w:t xml:space="preserve">data availability statement supplied with this submission.</w:t>
       </w:r>
     </w:p>
   </w:footnote>

</xml_diff>